<commit_message>
Rework intake gate and proposal layout
</commit_message>
<xml_diff>
--- a/skills/bid-builder/assets/proposal-template.docx
+++ b/skills/bid-builder/assets/proposal-template.docx
@@ -2,16 +2,98 @@
 <file path=word/document.xml><?xml version="1.0" encoding="utf-8"?>
 <w:document xmlns:wpc="http://schemas.microsoft.com/office/word/2010/wordprocessingCanvas" xmlns:mo="http://schemas.microsoft.com/office/mac/office/2008/main" xmlns:mc="http://schemas.openxmlformats.org/markup-compatibility/2006" xmlns:mv="urn:schemas-microsoft-com:mac:vml" xmlns:o="urn:schemas-microsoft-com:office:office" xmlns:r="http://schemas.openxmlformats.org/officeDocument/2006/relationships" xmlns:m="http://schemas.openxmlformats.org/officeDocument/2006/math" xmlns:v="urn:schemas-microsoft-com:vml" xmlns:wp14="http://schemas.microsoft.com/office/word/2010/wordprocessingDrawing" xmlns:wp="http://schemas.openxmlformats.org/drawingml/2006/wordprocessingDrawing" xmlns:w10="urn:schemas-microsoft-com:office:word" xmlns:w="http://schemas.openxmlformats.org/wordprocessingml/2006/main" xmlns:w14="http://schemas.microsoft.com/office/word/2010/wordml" xmlns:wpg="http://schemas.microsoft.com/office/word/2010/wordprocessingGroup" xmlns:wpi="http://schemas.microsoft.com/office/word/2010/wordprocessingInk" xmlns:wne="http://schemas.microsoft.com/office/word/2006/wordml" xmlns:wps="http://schemas.microsoft.com/office/word/2010/wordprocessingShape" mc:Ignorable="w14 wp14">
   <w:body>
+    <w:tbl>
+      <w:tblPr>
+        <w:tblW w:type="auto" w:w="0"/>
+        <w:jc w:val="left"/>
+        <w:tblLayout w:type="fixed"/>
+        <w:tblLook w:firstColumn="1" w:firstRow="1" w:lastColumn="0" w:lastRow="0" w:noHBand="0" w:noVBand="1" w:val="04A0"/>
+      </w:tblPr>
+      <w:tblGrid>
+        <w:gridCol w:w="5630"/>
+        <w:gridCol w:w="5630"/>
+      </w:tblGrid>
+      <w:tr>
+        <w:tc>
+          <w:tcPr>
+            <w:tcW w:type="dxa" w:w="6264"/>
+          </w:tcPr>
+          <w:p>
+            <w:r>
+              <w:drawing>
+                <wp:inline xmlns:a="http://schemas.openxmlformats.org/drawingml/2006/main" xmlns:pic="http://schemas.openxmlformats.org/drawingml/2006/picture">
+                  <wp:extent cx="3063240" cy="445262"/>
+                  <wp:docPr id="1" name="Picture 1"/>
+                  <wp:cNvGraphicFramePr>
+                    <a:graphicFrameLocks noChangeAspect="1"/>
+                  </wp:cNvGraphicFramePr>
+                  <a:graphic>
+                    <a:graphicData uri="http://schemas.openxmlformats.org/drawingml/2006/picture">
+                      <pic:pic>
+                        <pic:nvPicPr>
+                          <pic:cNvPr id="0" name="company-logo.jpg"/>
+                          <pic:cNvPicPr/>
+                        </pic:nvPicPr>
+                        <pic:blipFill>
+                          <a:blip r:embed="rId9"/>
+                          <a:stretch>
+                            <a:fillRect/>
+                          </a:stretch>
+                        </pic:blipFill>
+                        <pic:spPr>
+                          <a:xfrm>
+                            <a:off x="0" y="0"/>
+                            <a:ext cx="3063240" cy="445262"/>
+                          </a:xfrm>
+                          <a:prstGeom prst="rect"/>
+                        </pic:spPr>
+                      </pic:pic>
+                    </a:graphicData>
+                  </a:graphic>
+                </wp:inline>
+              </w:drawing>
+            </w:r>
+          </w:p>
+        </w:tc>
+        <w:tc>
+          <w:tcPr>
+            <w:tcW w:type="dxa" w:w="4997"/>
+            <w:vAlign w:val="center"/>
+            <w:tcBorders>
+              <w:left w:val="single" w:sz="5" w:color="5BC0DE"/>
+            </w:tcBorders>
+          </w:tcPr>
+          <w:p>
+            <w:r>
+              <w:rPr>
+                <w:rFonts w:ascii="Arial" w:hAnsi="Arial"/>
+                <w:sz w:val="18"/>
+              </w:rPr>
+              <w:t>1220 South Pasadena, Mesa, AZ 85210</w:t>
+              <w:br/>
+              <w:t>480-969-6606    www.partitionsco.com</w:t>
+              <w:br/>
+              <w:t>ROC # CR60 110352    Tax ID#07370669</w:t>
+            </w:r>
+          </w:p>
+        </w:tc>
+      </w:tr>
+    </w:tbl>
     <w:p>
       <w:r>
-        <w:t>This body is replaced by the proposal generator.</w:t>
+        <w:rPr>
+          <w:rFonts w:ascii="Arial" w:hAnsi="Arial"/>
+          <w:i/>
+          <w:color w:val="595959"/>
+          <w:sz w:val="18"/>
+        </w:rPr>
+        <w:t>Proposal body is generated by BID Builder.</w:t>
       </w:r>
     </w:p>
     <w:sectPr>
-      <w:headerReference w:type="default" r:id="rId9"/>
       <w:footerReference w:type="default" r:id="rId10"/>
       <w:pgSz w:w="12240" w:h="15840"/>
-      <w:pgMar w:top="936" w:right="1037" w:bottom="936" w:left="1037" w:header="720" w:footer="720" w:gutter="0"/>
+      <w:pgMar w:top="461" w:right="490" w:bottom="1181" w:left="490" w:header="720" w:footer="230" w:gutter="0"/>
       <w:cols w:space="720"/>
       <w:docGrid w:linePitch="360"/>
     </w:sectPr>
@@ -24,32 +106,17 @@
   <w:p>
     <w:pPr>
       <w:pStyle w:val="Footer"/>
-      <w:jc w:val="center"/>
+      <w:jc w:val="both"/>
     </w:pPr>
     <w:r>
-      <w:t>1220 South Pasadena, Mesa, AZ 85210  •  480-969-6606  •  ROC # CR60 110352</w:t>
+      <w:rPr>
+        <w:rFonts w:ascii="Arial" w:hAnsi="Arial"/>
+        <w:sz w:val="11"/>
+      </w:rPr>
+      <w:t>Customer-specific terms and conditions are inserted by the proposal generator from the approved clause profile.</w:t>
     </w:r>
   </w:p>
 </w:ftr>
-</file>
-
-<file path=word/header1.xml><?xml version="1.0" encoding="utf-8"?>
-<w:hdr xmlns:m="http://schemas.openxmlformats.org/officeDocument/2006/math" xmlns:mc="http://schemas.openxmlformats.org/markup-compatibility/2006" xmlns:mo="http://schemas.microsoft.com/office/mac/office/2008/main" xmlns:mv="urn:schemas-microsoft-com:mac:vml" xmlns:o="urn:schemas-microsoft-com:office:office" xmlns:r="http://schemas.openxmlformats.org/officeDocument/2006/relationships" xmlns:v="urn:schemas-microsoft-com:vml" xmlns:w10="urn:schemas-microsoft-com:office:word" xmlns:w14="http://schemas.microsoft.com/office/word/2010/wordml" xmlns:w="http://schemas.openxmlformats.org/wordprocessingml/2006/main" xmlns:wne="http://schemas.microsoft.com/office/word/2006/wordml" xmlns:wp14="http://schemas.microsoft.com/office/word/2010/wordprocessingDrawing" xmlns:wp="http://schemas.openxmlformats.org/drawingml/2006/wordprocessingDrawing" xmlns:wpc="http://schemas.microsoft.com/office/word/2010/wordprocessingCanvas" xmlns:wpg="http://schemas.microsoft.com/office/word/2010/wordprocessingGroup" xmlns:wpi="http://schemas.microsoft.com/office/word/2010/wordprocessingInk" xmlns:wps="http://schemas.microsoft.com/office/word/2010/wordprocessingShape" mc:Ignorable="w14 wp14">
-  <w:p>
-    <w:pPr>
-      <w:pStyle w:val="Header"/>
-    </w:pPr>
-    <w:r>
-      <w:rPr>
-        <w:rFonts w:ascii="Aptos" w:hAnsi="Aptos"/>
-        <w:b/>
-        <w:color w:val="D88A3D"/>
-        <w:sz w:val="16"/>
-      </w:rPr>
-      <w:t>PARTITIONS &amp; ACCESSORIES CO.  /  COMMERCIAL PROPOSAL</w:t>
-    </w:r>
-  </w:p>
-</w:hdr>
 </file>
 
 <file path=word/numbering.xml><?xml version="1.0" encoding="utf-8"?>
@@ -416,8 +483,8 @@
     <w:qFormat/>
     <w:rsid w:val="00FC693F"/>
     <w:rPr>
-      <w:rFonts w:ascii="Aptos" w:hAnsi="Aptos"/>
-      <w:sz w:val="19"/>
+      <w:rFonts w:ascii="Arial" w:hAnsi="Arial"/>
+      <w:sz w:val="18"/>
     </w:rPr>
   </w:style>
   <w:style w:type="paragraph" w:styleId="Header">

</xml_diff>